<commit_message>
Sociedad Identidad e Territorios
</commit_message>
<xml_diff>
--- a/Primeiro Semestre/Algoritmos e Lógica De Programação/Curso Linguagem C/Resumo.docx
+++ b/Primeiro Semestre/Algoritmos e Lógica De Programação/Curso Linguagem C/Resumo.docx
@@ -156,7 +156,35 @@
           <w:rFonts w:ascii="Times New Roman" w:hAnsi="Times New Roman"/>
           <w:sz w:val="24"/>
         </w:rPr>
-        <w:t>For (valor inicial; condição final; valor incremento)</w:t>
+        <w:t>For (valor</w:t>
+      </w:r>
+      <w:r>
+        <w:rPr>
+          <w:rFonts w:ascii="Times New Roman" w:hAnsi="Times New Roman"/>
+          <w:sz w:val="24"/>
+        </w:rPr>
+        <w:t>_ inicial; condição_</w:t>
+      </w:r>
+      <w:r>
+        <w:rPr>
+          <w:rFonts w:ascii="Times New Roman" w:hAnsi="Times New Roman"/>
+          <w:sz w:val="24"/>
+        </w:rPr>
+        <w:t>final; valor</w:t>
+      </w:r>
+      <w:r>
+        <w:rPr>
+          <w:rFonts w:ascii="Times New Roman" w:hAnsi="Times New Roman"/>
+          <w:sz w:val="24"/>
+        </w:rPr>
+        <w:t>_</w:t>
+      </w:r>
+      <w:r>
+        <w:rPr>
+          <w:rFonts w:ascii="Times New Roman" w:hAnsi="Times New Roman"/>
+          <w:sz w:val="24"/>
+        </w:rPr>
+        <w:t xml:space="preserve"> incremento)</w:t>
       </w:r>
     </w:p>
     <w:p>
@@ -197,7 +225,14 @@
           <w:sz w:val="24"/>
         </w:rPr>
         <w:tab/>
-        <w:t>Instruções;</w:t>
+        <w:t>i</w:t>
+      </w:r>
+      <w:r>
+        <w:rPr>
+          <w:rFonts w:ascii="Times New Roman" w:hAnsi="Times New Roman"/>
+          <w:sz w:val="24"/>
+        </w:rPr>
+        <w:t>nstruções;</w:t>
       </w:r>
     </w:p>
     <w:p>
@@ -932,7 +967,23 @@
           <w:b/>
           <w:sz w:val="24"/>
         </w:rPr>
-        <w:t xml:space="preserve">() </w:t>
+        <w:t>(</w:t>
+      </w:r>
+      <w:r>
+        <w:rPr>
+          <w:rFonts w:ascii="Times New Roman" w:hAnsi="Times New Roman"/>
+          <w:b/>
+          <w:sz w:val="24"/>
+        </w:rPr>
+        <w:t>x</w:t>
+      </w:r>
+      <w:r>
+        <w:rPr>
+          <w:rFonts w:ascii="Times New Roman" w:hAnsi="Times New Roman"/>
+          <w:b/>
+          <w:sz w:val="24"/>
+        </w:rPr>
+        <w:t xml:space="preserve">) </w:t>
       </w:r>
       <w:r>
         <w:rPr>
@@ -1343,28 +1394,14 @@
           <w:rFonts w:ascii="Times New Roman" w:hAnsi="Times New Roman"/>
           <w:sz w:val="24"/>
         </w:rPr>
-        <w:t xml:space="preserve">Continuar aqui, </w:t>
-      </w:r>
-      <w:r>
-        <w:rPr>
-          <w:rFonts w:ascii="Times New Roman" w:hAnsi="Times New Roman"/>
-          <w:sz w:val="24"/>
-        </w:rPr>
-        <w:t xml:space="preserve">Vetor - </w:t>
-      </w:r>
-      <w:r>
-        <w:rPr>
-          <w:rFonts w:ascii="Times New Roman" w:hAnsi="Times New Roman"/>
-          <w:sz w:val="24"/>
-        </w:rPr>
-        <w:t>Linguagem C</w:t>
-      </w:r>
-      <w:r>
-        <w:rPr>
-          <w:rFonts w:ascii="Times New Roman" w:hAnsi="Times New Roman"/>
-          <w:sz w:val="24"/>
-        </w:rPr>
-        <w:t xml:space="preserve"> - array</w:t>
+        <w:t>Continuar aqui,</w:t>
+      </w:r>
+      <w:r>
+        <w:rPr>
+          <w:rFonts w:ascii="Times New Roman" w:hAnsi="Times New Roman"/>
+          <w:sz w:val="24"/>
+        </w:rPr>
+        <w:t xml:space="preserve"> Repetição for</w:t>
       </w:r>
       <w:r>
         <w:rPr>
@@ -1409,7 +1446,7 @@
           <w:rFonts w:ascii="Times New Roman" w:hAnsi="Times New Roman"/>
           <w:sz w:val="24"/>
         </w:rPr>
-        <w:t>x</w:t>
+        <w:t>X</w:t>
       </w:r>
       <w:r>
         <w:rPr>
@@ -1447,7 +1484,7 @@
           <w:rFonts w:ascii="Times New Roman" w:hAnsi="Times New Roman"/>
           <w:sz w:val="24"/>
         </w:rPr>
-        <w:t>x</w:t>
+        <w:t>X</w:t>
       </w:r>
       <w:r>
         <w:rPr>
@@ -1478,7 +1515,21 @@
           <w:sz w:val="24"/>
         </w:rPr>
         <w:tab/>
-        <w:t xml:space="preserve">() – Fazendo o prático junto, caso tenha;  </w:t>
+        <w:t>(</w:t>
+      </w:r>
+      <w:r>
+        <w:rPr>
+          <w:rFonts w:ascii="Times New Roman" w:hAnsi="Times New Roman"/>
+          <w:sz w:val="24"/>
+        </w:rPr>
+        <w:t>X</w:t>
+      </w:r>
+      <w:r>
+        <w:rPr>
+          <w:rFonts w:ascii="Times New Roman" w:hAnsi="Times New Roman"/>
+          <w:sz w:val="24"/>
+        </w:rPr>
+        <w:t xml:space="preserve">) – Fazendo o prático junto, caso tenha;  </w:t>
       </w:r>
     </w:p>
     <w:p>

</xml_diff>